<commit_message>
2.2: hibritlesme enerji diyagramlari baski boyutunda yeniden cizildi (Be, B, N, O diyagrami 2x2 duzende)
</commit_message>
<xml_diff>
--- a/Kim12-2-2-Hibritlesme.docx
+++ b/Kim12-2-2-Hibritlesme.docx
@@ -1104,7 +1104,7 @@
       <w:r>
         <w:drawing>
           <wp:inline distT="0" distB="0" distL="0" distR="0">
-            <wp:extent cx="5760000" cy="1831602"/>
+            <wp:extent cx="5757683" cy="2157988"/>
             <wp:docPr id="900002" name="Grafik 900002" descr="Karbon atomu orbital enerji diyagramları"/>
             <wp:cNvGraphicFramePr>
               <a:graphicFrameLocks noChangeAspect="1"/>
@@ -1125,7 +1125,7 @@
                   <pic:spPr>
                     <a:xfrm>
                       <a:off x="0" y="0"/>
-                      <a:ext cx="5760000" cy="1831602"/>
+                      <a:ext cx="5757683" cy="2157988"/>
                     </a:xfrm>
                     <a:prstGeom prst="rect">
                       <a:avLst/>
@@ -2138,7 +2138,7 @@
       <w:r>
         <w:drawing>
           <wp:inline distT="0" distB="0" distL="0" distR="0">
-            <wp:extent cx="5760000" cy="1391722"/>
+            <wp:extent cx="5757683" cy="3453390"/>
             <wp:docPr id="900005" name="Grafik 900005" descr="Merkez atomların orbital enerji diyagramları"/>
             <wp:cNvGraphicFramePr>
               <a:graphicFrameLocks noChangeAspect="1"/>
@@ -2159,7 +2159,7 @@
                   <pic:spPr>
                     <a:xfrm>
                       <a:off x="0" y="0"/>
-                      <a:ext cx="5760000" cy="1391722"/>
+                      <a:ext cx="5757683" cy="3453390"/>
                     </a:xfrm>
                     <a:prstGeom prst="rect">
                       <a:avLst/>

</xml_diff>

<commit_message>
Kim12-2-2-Hibritlesme: gorsel alanlarina Shutter onizlemeleri yerlestirildi (2.3 bicimi)
</commit_message>
<xml_diff>
--- a/Kim12-2-2-Hibritlesme.docx
+++ b/Kim12-2-2-Hibritlesme.docx
@@ -99,85 +99,59 @@
         <w:t xml:space="preserve"> şeklindedir ve bu dizilimde bağ yapmaya hazır yalnızca iki yarı dolu orbital bulunur. Üstelik bu orbitallerden 2s ve 2p’nin enerjileri ve şekilleri birbirinden farklıdır. Peki karbon atomu nasıl oluyor da dört özdeş bağ yapabiliyor? Eten ve etin moleküllerinde karbon atomu neden üç ya da iki atomla bağ yapar? Bu soruların cevabını bir etkinlik yaparak keşfediniz. Analiz ve Keşif Atölyesi 2.2.’de kanıt kullanacaksınız: Karbon atomunun bağ sayıları, atom orbitallerinin bağıl enerjileri ve değerlik orbitallerini ölçüt olarak belirleyecek, enerji diyagramları ve orbital şekillerinden elde ettiğiniz verileri sistemli biçimde kaydedecek, hibrit orbitallerin oluşumuna ilişkin örüntüyü belirleyerek bu örüntüyü kanıtlara dayanarak açıklayacaksınız. Diyagram ve üç boyutlu modelleri okuyup yorumlamanız görsel okuryazarlığınızı, adım adım ve düzenli çalışmanız sistematik düşünme eğiliminizi geliştirecek; farklı moleküllerin merkez atomlarını karşılaştırırken araştırmacı ve sorgulayıcı bir tutumla çalışkanlık değerinizi destekleyeceksiniz.</w:t>
       </w:r>
     </w:p>
-    <w:tbl>
-      <w:tblPr>
-        <w:tblW w:w="9000" w:type="dxa"/>
+    <w:p>
+      <w:pPr>
         <w:jc w:val="center"/>
-        <w:tblBorders>
-          <w:top w:val="single" w:sz="8" w:space="0" w:color="7F7F7F"/>
-          <w:left w:val="single" w:sz="8" w:space="0" w:color="7F7F7F"/>
-          <w:bottom w:val="single" w:sz="8" w:space="0" w:color="7F7F7F"/>
-          <w:right w:val="single" w:sz="8" w:space="0" w:color="7F7F7F"/>
-        </w:tblBorders>
-      </w:tblPr>
-      <w:tblGrid>
-        <w:gridCol w:w="9000"/>
-      </w:tblGrid>
-      <w:tr>
-        <w:tc>
-          <w:tcPr>
-            <w:tcW w:w="9000" w:type="dxa"/>
-            <w:shd w:val="clear" w:color="auto" w:fill="EDEDED"/>
-          </w:tcPr>
-          <w:p>
-            <w:pPr>
-              <w:jc w:val="both"/>
-              <w:rPr>
-                <w:rFonts w:ascii="Times New Roman" w:hAnsi="Times New Roman" w:cs="Times New Roman"/>
-                <w:lang w:val="tr-TR"/>
-              </w:rPr>
-            </w:pPr>
-            <w:r>
-              <w:rPr>
-                <w:rFonts w:ascii="Times New Roman" w:hAnsi="Times New Roman" w:cs="Times New Roman"/>
-                <w:lang w:val="tr-TR"/>
-              </w:rPr>
-              <w:t xml:space="preserve">GÖRSEL ALANI (Shutterstock)</w:t>
-            </w:r>
-          </w:p>
-          <w:p>
-            <w:pPr>
-              <w:jc w:val="both"/>
-              <w:rPr>
-                <w:rFonts w:ascii="Times New Roman" w:hAnsi="Times New Roman" w:cs="Times New Roman"/>
-                <w:lang w:val="tr-TR"/>
-              </w:rPr>
-            </w:pPr>
-            <w:r>
-              <w:rPr>
-                <w:rFonts w:ascii="Times New Roman" w:hAnsi="Times New Roman" w:cs="Times New Roman"/>
-                <w:lang w:val="tr-TR"/>
-              </w:rPr>
-              <w:t xml:space="preserve">Tarif: Bir ocak brülöründe yanan mavi doğal gaz alevi, yakın çekim (marka/logo görünmeyen).</w:t>
-            </w:r>
-          </w:p>
-          <w:p>
-            <w:pPr>
-              <w:jc w:val="both"/>
-              <w:rPr>
-                <w:rFonts w:ascii="Times New Roman" w:hAnsi="Times New Roman" w:cs="Times New Roman"/>
-                <w:lang w:val="tr-TR"/>
-              </w:rPr>
-            </w:pPr>
-            <w:r>
-              <w:rPr>
-                <w:rFonts w:ascii="Times New Roman" w:hAnsi="Times New Roman" w:cs="Times New Roman"/>
-                <w:lang w:val="tr-TR"/>
-              </w:rPr>
-              <w:t xml:space="preserve">Shutter ID: 2850219921 (fotoğraf) — Close-up of a gas burner with vibrant blue flame</w:t>
-            </w:r>
-          </w:p>
-        </w:tc>
-      </w:tr>
-    </w:tbl>
+      </w:pPr>
+      <w:r>
+        <w:drawing>
+          <wp:inline xmlns:a="http://schemas.openxmlformats.org/drawingml/2006/main" xmlns:pic="http://schemas.openxmlformats.org/drawingml/2006/picture">
+            <wp:extent cx="3085714" cy="2520000"/>
+            <wp:docPr id="900012" name="Picture 900012"/>
+            <wp:cNvGraphicFramePr>
+              <a:graphicFrameLocks noChangeAspect="1"/>
+            </wp:cNvGraphicFramePr>
+            <a:graphic>
+              <a:graphicData uri="http://schemas.openxmlformats.org/drawingml/2006/picture">
+                <pic:pic>
+                  <pic:nvPicPr>
+                    <pic:cNvPr id="0" name="2850219921_d.jpg"/>
+                    <pic:cNvPicPr/>
+                  </pic:nvPicPr>
+                  <pic:blipFill>
+                    <a:blip r:embed="rId11"/>
+                    <a:stretch>
+                      <a:fillRect/>
+                    </a:stretch>
+                  </pic:blipFill>
+                  <pic:spPr>
+                    <a:xfrm>
+                      <a:off x="0" y="0"/>
+                      <a:ext cx="3085714" cy="2520000"/>
+                    </a:xfrm>
+                    <a:prstGeom prst="rect"/>
+                  </pic:spPr>
+                </pic:pic>
+              </a:graphicData>
+            </a:graphic>
+          </wp:inline>
+        </w:drawing>
+      </w:r>
+    </w:p>
     <w:p>
       <w:pPr>
-        <w:jc w:val="both"/>
-        <w:rPr>
-          <w:rFonts w:ascii="Times New Roman" w:hAnsi="Times New Roman" w:cs="Times New Roman"/>
-          <w:lang w:val="tr-TR"/>
-        </w:rPr>
-      </w:pPr>
+        <w:jc w:val="center"/>
+      </w:pPr>
+      <w:r>
+        <w:rPr>
+          <w:rFonts w:ascii="Times New Roman" w:hAnsi="Times New Roman" w:cs="Times New Roman"/>
+          <w:b/>
+          <w:bCs/>
+          <w:highlight w:val="yellow"/>
+          <w:lang w:val="tr-TR"/>
+        </w:rPr>
+        <w:t xml:space="preserve">Shutter id: 2850219921</w:t>
+      </w:r>
     </w:p>
     <w:p>
       <w:pPr>

</xml_diff>